<commit_message>
fix: remove Roadmap section from EGP TGX Permitting blueprint
Per review feedback, the blueprint structure must not include the
Roadmap Draft section. Removed heading, empty para, Table 9 (7x4),
and Durata Totale Stimata paragraph from the generated .docx.
Document now flows: Delta AS-IS vs TO-BE -> 6. KPI directly.

Agent-Logs-Url: https://github.com/rabateA30/BluePrintGenerator_v2.0/sessions/f402efa7-af67-47a1-ba05-fcbb64e6bf85

Co-authored-by: rabateA30 <181829368+rabateA30@users.noreply.github.com>
</commit_message>
<xml_diff>
--- a/Blueprint/Blueprint_EGP_TGX_Permitting_IT_COMPLETO.docx
+++ b/Blueprint/Blueprint_EGP_TGX_Permitting_IT_COMPLETO.docx
@@ -6908,490 +6908,6 @@
     <w:p>
       <w:r>
         <w:t xml:space="preserve"> </w:t>
-      </w:r>
-    </w:p>
-    <w:p>
-      <w:pPr>
-        <w:pStyle w:val="Titolo2"/>
-        <w:rPr>
-          <w:lang w:val="en-US"/>
-        </w:rPr>
-      </w:pPr>
-      <w:bookmarkStart w:id="13" w:name="_Toc227834734"/>
-      <w:r>
-        <w:rPr>
-          <w:lang w:val="en-US"/>
-        </w:rPr>
-        <w:t>5. Roadmap Draft</w:t>
-      </w:r>
-      <w:bookmarkEnd w:id="13"/>
-    </w:p>
-    <w:p>
-      <w:pPr>
-        <w:rPr>
-          <w:lang w:val="en-US"/>
-        </w:rPr>
-      </w:pPr>
-    </w:p>
-    <w:tbl>
-      <w:tblPr>
-        <w:tblStyle w:val="Tabellagriglia1chiara-colore1"/>
-        <w:tblW w:w="5000" w:type="pct"/>
-        <w:tblLook w:val="04A0" w:firstRow="1" w:lastRow="0" w:firstColumn="1" w:lastColumn="0" w:noHBand="0" w:noVBand="1"/>
-      </w:tblPr>
-      <w:tblGrid>
-        <w:gridCol w:w="1812"/>
-        <w:gridCol w:w="639"/>
-        <w:gridCol w:w="4908"/>
-        <w:gridCol w:w="2269"/>
-      </w:tblGrid>
-      <w:tr>
-        <w:trPr>
-          <w:cnfStyle w:val="100000000000" w:firstRow="1" w:lastRow="0" w:firstColumn="0" w:lastColumn="0" w:oddVBand="0" w:evenVBand="0" w:oddHBand="0" w:evenHBand="0" w:firstRowFirstColumn="0" w:firstRowLastColumn="0" w:lastRowFirstColumn="0" w:lastRowLastColumn="0"/>
-          <w:trHeight w:val="288"/>
-        </w:trPr>
-        <w:tc>
-          <w:tcPr>
-            <w:cnfStyle w:val="001000000000" w:firstRow="0" w:lastRow="0" w:firstColumn="1" w:lastColumn="0" w:oddVBand="0" w:evenVBand="0" w:oddHBand="0" w:evenHBand="0" w:firstRowFirstColumn="0" w:firstRowLastColumn="0" w:lastRowFirstColumn="0" w:lastRowLastColumn="0"/>
-            <w:tcW w:w="1009" w:type="pct"/>
-            <w:noWrap/>
-            <w:vAlign w:val="center"/>
-            <w:hideMark/>
-          </w:tcPr>
-          <w:p>
-            <w:pPr>
-              <w:spacing w:before="0"/>
-              <w:rPr>
-                <w:rFonts w:ascii="Aptos Narrow" w:eastAsia="Times New Roman" w:hAnsi="Aptos Narrow" w:cs="Times New Roman"/>
-                <w:sz w:val="16"/>
-                <w:szCs w:val="16"/>
-                <w:lang w:eastAsia="it-IT"/>
-              </w:rPr>
-            </w:pPr>
-            <w:r>
-              <w:rPr>
-                <w:rFonts w:ascii="Segoe UI" w:hAnsi="Segoe UI" w:cs="Segoe UI"/>
-              </w:rPr>
-              <w:t>Fase</w:t>
-            </w:r>
-          </w:p>
-        </w:tc>
-        <w:tc>
-          <w:tcPr>
-            <w:tcW w:w="128" w:type="pct"/>
-            <w:noWrap/>
-            <w:vAlign w:val="center"/>
-            <w:hideMark/>
-          </w:tcPr>
-          <w:p>
-            <w:pPr>
-              <w:spacing w:before="0"/>
-              <w:cnfStyle w:val="100000000000" w:firstRow="1" w:lastRow="0" w:firstColumn="0" w:lastColumn="0" w:oddVBand="0" w:evenVBand="0" w:oddHBand="0" w:evenHBand="0" w:firstRowFirstColumn="0" w:firstRowLastColumn="0" w:lastRowFirstColumn="0" w:lastRowLastColumn="0"/>
-              <w:rPr>
-                <w:rFonts w:ascii="Aptos Narrow" w:eastAsia="Times New Roman" w:hAnsi="Aptos Narrow" w:cs="Times New Roman"/>
-                <w:sz w:val="16"/>
-                <w:szCs w:val="16"/>
-                <w:lang w:eastAsia="it-IT"/>
-              </w:rPr>
-            </w:pPr>
-            <w:r>
-              <w:rPr>
-                <w:rFonts w:ascii="Segoe UI" w:hAnsi="Segoe UI" w:cs="Segoe UI"/>
-              </w:rPr>
-              <w:t>Step</w:t>
-            </w:r>
-          </w:p>
-        </w:tc>
-        <w:tc>
-          <w:tcPr>
-            <w:tcW w:w="2617" w:type="pct"/>
-            <w:noWrap/>
-            <w:vAlign w:val="center"/>
-            <w:hideMark/>
-          </w:tcPr>
-          <w:p>
-            <w:pPr>
-              <w:spacing w:before="0"/>
-              <w:cnfStyle w:val="100000000000" w:firstRow="1" w:lastRow="0" w:firstColumn="0" w:lastColumn="0" w:oddVBand="0" w:evenVBand="0" w:oddHBand="0" w:evenHBand="0" w:firstRowFirstColumn="0" w:firstRowLastColumn="0" w:lastRowFirstColumn="0" w:lastRowLastColumn="0"/>
-              <w:rPr>
-                <w:rFonts w:ascii="Aptos Narrow" w:eastAsia="Times New Roman" w:hAnsi="Aptos Narrow" w:cs="Times New Roman"/>
-                <w:sz w:val="16"/>
-                <w:szCs w:val="16"/>
-                <w:lang w:eastAsia="it-IT"/>
-              </w:rPr>
-            </w:pPr>
-            <w:r>
-              <w:rPr>
-                <w:rFonts w:ascii="Segoe UI" w:hAnsi="Segoe UI" w:cs="Segoe UI"/>
-              </w:rPr>
-              <w:t>Task</w:t>
-            </w:r>
-          </w:p>
-        </w:tc>
-        <w:tc>
-          <w:tcPr>
-            <w:tcW w:w="1246" w:type="pct"/>
-            <w:noWrap/>
-            <w:vAlign w:val="center"/>
-            <w:hideMark/>
-          </w:tcPr>
-          <w:p>
-            <w:pPr>
-              <w:spacing w:before="0"/>
-              <w:cnfStyle w:val="100000000000" w:firstRow="1" w:lastRow="0" w:firstColumn="0" w:lastColumn="0" w:oddVBand="0" w:evenVBand="0" w:oddHBand="0" w:evenHBand="0" w:firstRowFirstColumn="0" w:firstRowLastColumn="0" w:lastRowFirstColumn="0" w:lastRowLastColumn="0"/>
-              <w:rPr>
-                <w:rFonts w:ascii="Aptos Narrow" w:eastAsia="Times New Roman" w:hAnsi="Aptos Narrow" w:cs="Times New Roman"/>
-                <w:sz w:val="16"/>
-                <w:szCs w:val="16"/>
-                <w:lang w:eastAsia="it-IT"/>
-              </w:rPr>
-            </w:pPr>
-            <w:r>
-              <w:rPr>
-                <w:rFonts w:ascii="Segoe UI" w:hAnsi="Segoe UI" w:cs="Segoe UI"/>
-              </w:rPr>
-              <w:t>Deliverable</w:t>
-            </w:r>
-          </w:p>
-        </w:tc>
-      </w:tr>
-      <w:tr>
-        <w:trPr>
-          <w:trHeight w:val="288"/>
-        </w:trPr>
-        <w:tc>
-          <w:tcPr>
-            <w:cnfStyle w:val="001000000000" w:firstRow="0" w:lastRow="0" w:firstColumn="1" w:lastColumn="0" w:oddVBand="0" w:evenVBand="0" w:oddHBand="0" w:evenHBand="0" w:firstRowFirstColumn="0" w:firstRowLastColumn="0" w:lastRowFirstColumn="0" w:lastRowLastColumn="0"/>
-            <w:tcW w:w="1009" w:type="pct"/>
-            <w:noWrap/>
-            <w:vAlign w:val="center"/>
-          </w:tcPr>
-          <w:p>
-            <w:r>
-              <w:t>Fase 1 — Foundation</w:t>
-            </w:r>
-          </w:p>
-        </w:tc>
-        <w:tc>
-          <w:tcPr>
-            <w:tcW w:w="128" w:type="pct"/>
-            <w:noWrap/>
-            <w:vAlign w:val="center"/>
-          </w:tcPr>
-          <w:p>
-            <w:r>
-              <w:t>M1-M3</w:t>
-            </w:r>
-          </w:p>
-        </w:tc>
-        <w:tc>
-          <w:tcPr>
-            <w:tcW w:w="2617" w:type="pct"/>
-            <w:noWrap/>
-            <w:vAlign w:val="center"/>
-          </w:tcPr>
-          <w:p>
-            <w:r>
-              <w:t>Setup infrastruttura cloud Azure; integrazione SAP DMS e SharePoint API; data migration storico pratiche</w:t>
-            </w:r>
-          </w:p>
-        </w:tc>
-        <w:tc>
-          <w:tcPr>
-            <w:tcW w:w="1246" w:type="pct"/>
-            <w:noWrap/>
-            <w:vAlign w:val="center"/>
-          </w:tcPr>
-          <w:p>
-            <w:r>
-              <w:t>Ambiente cloud operativo; Connettori SAP/SharePoint deployati; Dataset storico pratiche strutturato</w:t>
-            </w:r>
-          </w:p>
-        </w:tc>
-      </w:tr>
-      <w:tr>
-        <w:trPr>
-          <w:trHeight w:val="288"/>
-        </w:trPr>
-        <w:tc>
-          <w:tcPr>
-            <w:cnfStyle w:val="001000000000" w:firstRow="0" w:lastRow="0" w:firstColumn="1" w:lastColumn="0" w:oddVBand="0" w:evenVBand="0" w:oddHBand="0" w:evenHBand="0" w:firstRowFirstColumn="0" w:firstRowLastColumn="0" w:lastRowFirstColumn="0" w:lastRowLastColumn="0"/>
-            <w:tcW w:w="1009" w:type="pct"/>
-            <w:noWrap/>
-            <w:vAlign w:val="center"/>
-          </w:tcPr>
-          <w:p>
-            <w:r>
-              <w:t>Fase 2 — Document Intelligence</w:t>
-            </w:r>
-          </w:p>
-        </w:tc>
-        <w:tc>
-          <w:tcPr>
-            <w:tcW w:w="128" w:type="pct"/>
-            <w:noWrap/>
-            <w:vAlign w:val="center"/>
-          </w:tcPr>
-          <w:p>
-            <w:r>
-              <w:t>M3-M5</w:t>
-            </w:r>
-          </w:p>
-        </w:tc>
-        <w:tc>
-          <w:tcPr>
-            <w:tcW w:w="2617" w:type="pct"/>
-            <w:noWrap/>
-            <w:vAlign w:val="center"/>
-          </w:tcPr>
-          <w:p>
-            <w:r>
-              <w:t>Deploy Azure AI Document Intelligence; training modello classificazione su corpus pratiche EGP; integrazione NLP normative KB</w:t>
-            </w:r>
-          </w:p>
-        </w:tc>
-        <w:tc>
-          <w:tcPr>
-            <w:tcW w:w="1246" w:type="pct"/>
-            <w:noWrap/>
-            <w:vAlign w:val="center"/>
-          </w:tcPr>
-          <w:p>
-            <w:r>
-              <w:t>Modello classificazione documenti (F1 &gt; 85%); Normative KB operativa con copertura D.Lgs. 387/2003 e normative regionali principali</w:t>
-            </w:r>
-          </w:p>
-        </w:tc>
-      </w:tr>
-      <w:tr>
-        <w:trPr>
-          <w:trHeight w:val="288"/>
-        </w:trPr>
-        <w:tc>
-          <w:tcPr>
-            <w:cnfStyle w:val="001000000000" w:firstRow="0" w:lastRow="0" w:firstColumn="1" w:lastColumn="0" w:oddVBand="0" w:evenVBand="0" w:oddHBand="0" w:evenHBand="0" w:firstRowFirstColumn="0" w:firstRowLastColumn="0" w:lastRowFirstColumn="0" w:lastRowLastColumn="0"/>
-            <w:tcW w:w="1009" w:type="pct"/>
-            <w:noWrap/>
-            <w:vAlign w:val="center"/>
-          </w:tcPr>
-          <w:p>
-            <w:r>
-              <w:t>Fase 3 — Workflow Automation</w:t>
-            </w:r>
-          </w:p>
-        </w:tc>
-        <w:tc>
-          <w:tcPr>
-            <w:tcW w:w="128" w:type="pct"/>
-            <w:noWrap/>
-            <w:vAlign w:val="center"/>
-          </w:tcPr>
-          <w:p>
-            <w:r>
-              <w:t>M5-M7</w:t>
-            </w:r>
-          </w:p>
-        </w:tc>
-        <w:tc>
-          <w:tcPr>
-            <w:tcW w:w="2617" w:type="pct"/>
-            <w:noWrap/>
-            <w:vAlign w:val="center"/>
-          </w:tcPr>
-          <w:p>
-            <w:r>
-              <w:t>Sviluppo Permitting Platform (workflow engine, check-list AI, deadline tracker); integrazione firma digitale; Pilot su 2 regioni (Puglia, Sicilia)</w:t>
-            </w:r>
-          </w:p>
-        </w:tc>
-        <w:tc>
-          <w:tcPr>
-            <w:tcW w:w="1246" w:type="pct"/>
-            <w:noWrap/>
-            <w:vAlign w:val="center"/>
-          </w:tcPr>
-          <w:p>
-            <w:r>
-              <w:t>Permitting Platform v1.0 in produzione su pilot; Riduzione 30% tempi gestione pratica su cohort pilota</w:t>
-            </w:r>
-          </w:p>
-        </w:tc>
-      </w:tr>
-      <w:tr>
-        <w:trPr>
-          <w:trHeight w:val="288"/>
-        </w:trPr>
-        <w:tc>
-          <w:tcPr>
-            <w:cnfStyle w:val="001000000000" w:firstRow="0" w:lastRow="0" w:firstColumn="1" w:lastColumn="0" w:oddVBand="0" w:evenVBand="0" w:oddHBand="0" w:evenHBand="0" w:firstRowFirstColumn="0" w:firstRowLastColumn="0" w:lastRowFirstColumn="0" w:lastRowLastColumn="0"/>
-            <w:tcW w:w="1009" w:type="pct"/>
-            <w:noWrap/>
-            <w:vAlign w:val="center"/>
-          </w:tcPr>
-          <w:p>
-            <w:r>
-              <w:t>Fase 4 — Predictive &amp; Monitoring</w:t>
-            </w:r>
-          </w:p>
-        </w:tc>
-        <w:tc>
-          <w:tcPr>
-            <w:tcW w:w="128" w:type="pct"/>
-            <w:noWrap/>
-            <w:vAlign w:val="center"/>
-          </w:tcPr>
-          <w:p>
-            <w:r>
-              <w:t>M7-M9</w:t>
-            </w:r>
-          </w:p>
-        </w:tc>
-        <w:tc>
-          <w:tcPr>
-            <w:tcW w:w="2617" w:type="pct"/>
-            <w:noWrap/>
-            <w:vAlign w:val="center"/>
-          </w:tcPr>
-          <w:p>
-            <w:r>
-              <w:t>Deploy Deadline Prediction Engine (ML); sviluppo monitoring agent portali PA; integrazione alerting proattivo su Teams</w:t>
-            </w:r>
-          </w:p>
-        </w:tc>
-        <w:tc>
-          <w:tcPr>
-            <w:tcW w:w="1246" w:type="pct"/>
-            <w:noWrap/>
-            <w:vAlign w:val="center"/>
-          </w:tcPr>
-          <w:p>
-            <w:r>
-              <w:t>Prediction accuracy scadenze &gt; 80%; Alert automatici operativi; 0 scadenze mancate su cohort monitorato</w:t>
-            </w:r>
-          </w:p>
-        </w:tc>
-      </w:tr>
-      <w:tr>
-        <w:trPr>
-          <w:trHeight w:val="288"/>
-        </w:trPr>
-        <w:tc>
-          <w:tcPr>
-            <w:cnfStyle w:val="001000000000" w:firstRow="0" w:lastRow="0" w:firstColumn="1" w:lastColumn="0" w:oddVBand="0" w:evenVBand="0" w:oddHBand="0" w:evenHBand="0" w:firstRowFirstColumn="0" w:firstRowLastColumn="0" w:lastRowFirstColumn="0" w:lastRowLastColumn="0"/>
-            <w:tcW w:w="1009" w:type="pct"/>
-            <w:noWrap/>
-            <w:vAlign w:val="center"/>
-          </w:tcPr>
-          <w:p>
-            <w:r>
-              <w:t>Fase 5 — Scale-up Nazionale</w:t>
-            </w:r>
-          </w:p>
-        </w:tc>
-        <w:tc>
-          <w:tcPr>
-            <w:tcW w:w="128" w:type="pct"/>
-            <w:noWrap/>
-            <w:vAlign w:val="center"/>
-          </w:tcPr>
-          <w:p>
-            <w:r>
-              <w:t>M9-M11</w:t>
-            </w:r>
-          </w:p>
-        </w:tc>
-        <w:tc>
-          <w:tcPr>
-            <w:tcW w:w="2617" w:type="pct"/>
-            <w:noWrap/>
-            <w:vAlign w:val="center"/>
-          </w:tcPr>
-          <w:p>
-            <w:r>
-              <w:t>Estensione a tutte le regioni italiane; onboarding tutti i Permitting Engineer; training change management</w:t>
-            </w:r>
-          </w:p>
-        </w:tc>
-        <w:tc>
-          <w:tcPr>
-            <w:tcW w:w="1246" w:type="pct"/>
-            <w:noWrap/>
-            <w:vAlign w:val="center"/>
-          </w:tcPr>
-          <w:p>
-            <w:r>
-              <w:t>Copertura 100% portafoglio pratiche EGP TGX; Adoption rate &gt; 90% team E&amp;C</w:t>
-            </w:r>
-          </w:p>
-        </w:tc>
-      </w:tr>
-      <w:tr>
-        <w:trPr>
-          <w:trHeight w:val="288"/>
-        </w:trPr>
-        <w:tc>
-          <w:tcPr>
-            <w:cnfStyle w:val="001000000000" w:firstRow="0" w:lastRow="0" w:firstColumn="1" w:lastColumn="0" w:oddVBand="0" w:evenVBand="0" w:oddHBand="0" w:evenHBand="0" w:firstRowFirstColumn="0" w:firstRowLastColumn="0" w:lastRowFirstColumn="0" w:lastRowLastColumn="0"/>
-            <w:tcW w:w="1009" w:type="pct"/>
-            <w:noWrap/>
-            <w:vAlign w:val="center"/>
-          </w:tcPr>
-          <w:p>
-            <w:r>
-              <w:t>Fase 6 — Ottimizzazione e Certificazione KPI</w:t>
-            </w:r>
-          </w:p>
-        </w:tc>
-        <w:tc>
-          <w:tcPr>
-            <w:tcW w:w="128" w:type="pct"/>
-            <w:noWrap/>
-            <w:vAlign w:val="center"/>
-          </w:tcPr>
-          <w:p>
-            <w:r>
-              <w:t>M11-M12</w:t>
-            </w:r>
-          </w:p>
-        </w:tc>
-        <w:tc>
-          <w:tcPr>
-            <w:tcW w:w="2617" w:type="pct"/>
-            <w:noWrap/>
-            <w:vAlign w:val="center"/>
-          </w:tcPr>
-          <w:p>
-            <w:r>
-              <w:t>Fine-tuning modelli AI con 6 mesi dati produzione; deploy reporting avanzato; validazione KPI target</w:t>
-            </w:r>
-          </w:p>
-        </w:tc>
-        <w:tc>
-          <w:tcPr>
-            <w:tcW w:w="1246" w:type="pct"/>
-            <w:noWrap/>
-            <w:vAlign w:val="center"/>
-          </w:tcPr>
-          <w:p>
-            <w:r>
-              <w:t>KPI finali raggiunti (riduzione 40% tempi, 0 scadenze mancate); Go-live soluzione completa certificata</w:t>
-            </w:r>
-          </w:p>
-        </w:tc>
-      </w:tr>
-    </w:tbl>
-    <w:p>
-      <w:pPr>
-        <w:rPr>
-          <w:b/>
-          <w:bCs/>
-        </w:rPr>
-      </w:pPr>
-      <w:r>
-        <w:rPr>
-          <w:b/>
-        </w:rPr>
-        <w:t>Durata Totale Stimata: 12 mesi</w:t>
       </w:r>
     </w:p>
     <w:p>

</xml_diff>